<commit_message>
Regenerate HW4 docx with updated features (382 PMC chunks, 9 tools, cost tracking)
Co-Authored-By: Claude Opus 4.6 <noreply@anthropic.com>
</commit_message>
<xml_diff>
--- a/HW4_Patrick_Roche_FINAL.docx
+++ b/HW4_Patrick_Roche_FINAL.docx
@@ -226,10 +226,10 @@
         <w:rPr>
           <w:b/>
         </w:rPr>
-        <w:t xml:space="preserve">Domain-specific autonomous tools (8 total). </w:t>
+        <w:t xml:space="preserve">Domain-specific autonomous tools (9 total). </w:t>
       </w:r>
       <w:r>
-        <w:t>Each agent has different tools matching their expertise, enforced server-side. CSO: PubMed + UniProt + STRING-DB. CTO: PubMed + ChEMBL + Open Targets Tractability. CMO: ClinicalTrials.gov + PubMed + Open Targets Safety. CBO: PubMed + Open Targets + ClinicalTrials.gov. Agents autonomously request tools during assessment via a two-pass approach: first LLM call produces assessment with optional TOOL_REQUEST lines → tools are executed → second LLM call revises assessment with tool results.</w:t>
+        <w:t>Each agent has different tools matching their expertise, enforced server-side. CSO: PubMed + UniProt + STRING-DB + PMC Full Text. CTO: PubMed + ChEMBL + Open Targets Tractability + PMC Full Text. CMO: ClinicalTrials.gov + PubMed + Open Targets Safety + PMC Full Text. CBO: PubMed + Open Targets + ClinicalTrials.gov + PMC Full Text. The search_and_read_papers tool retrieves full-text articles from PubMed Central (PMC) via Entrez.elink ID mapping and XML body parsing, truncated to 3,000 characters. Agents autonomously request tools during assessment via a two-pass approach: first LLM call produces assessment with optional TOOL_REQUEST lines → tools are executed → second LLM call revises assessment with tool results.</w:t>
       </w:r>
     </w:p>
     <w:p>
@@ -240,7 +240,7 @@
         <w:t xml:space="preserve">RAG knowledge bases. </w:t>
       </w:r>
       <w:r>
-        <w:t>ChromaDB vector store with Voyage AI embeddings (voyage-3-lite). 24 document chunks across 5 persistent collections: genomics target validation, modality selection guide, clinical trial design, biotech market analysis, and drug discovery pipeline. Each agent retrieves role-specific + shared institutional knowledge before reasoning.</w:t>
+        <w:t>ChromaDB vector store with Voyage AI embeddings (voyage-3-lite). 382 document chunks from 53 real PMC papers across 5 persistent collections — CSO: 130 chunks from 15 papers (GWAS, Mendelian randomization, CRISPR functional genomics); CTO: 65 chunks from 12 papers (druggability, ADC design, BBB delivery); CMO: 109 chunks from 15 papers (adaptive trials, FDA breakthrough therapy); CBO: 29 chunks from 5 papers (orphan drug pricing, market access); Shared: 49 chunks from 6 papers (drug discovery, OSMR/IBD). Papers were downloaded via a curated PubMed search script with PMC full-text enrichment (up to 8,000 characters per paper). Each agent retrieves role-specific + shared institutional knowledge before reasoning.</w:t>
       </w:r>
     </w:p>
     <w:p>
@@ -618,7 +618,7 @@
         <w:t xml:space="preserve">Limitations and tradeoffs. </w:t>
       </w:r>
       <w:r>
-        <w:t>ClinicalTrials.gov API returns 403 Forbidden from non-US IPs locally (works on Railway's US-based servers). RAG with only 24 seed chunks is minimal — production would need thousands of curated documents per agent role. Each full evaluation costs ~$0.25 in Anthropic API credits (Claude Sonnet for 10 LLM calls). No built-in agent trust or verification mechanism — when agents disagree, the Portfolio Director's resolution is only as good as its prompt engineering. Session storage is in-memory (resets on Railway redeploy); production would need a database.</w:t>
+        <w:t>ClinicalTrials.gov API returns 403 Forbidden from non-US IPs locally (works on Railway's US-based servers). Each full evaluation costs ~$0.25 in Anthropic API credits (Claude Sonnet for 10 LLM calls) — tracked per-node via usage_metadata token counting and aggregated in all API/WebSocket responses as estimated_cost_usd. No built-in agent trust or verification mechanism — when agents disagree, the Portfolio Director's resolution is only as good as its prompt engineering. Session storage is in-memory (resets on Railway redeploy); production would need a database.</w:t>
       </w:r>
     </w:p>
     <w:p>
@@ -754,7 +754,7 @@
           <w:color w:val="333399"/>
           <w:sz w:val="16"/>
         </w:rPr>
-        <w:t>LangGraph + FastAPI + ChromaDB + Voyage AI + Claude Sonnet</w:t>
+        <w:t>LangGraph + FastAPI + ChromaDB + Voyage AI + Claude Sonnet + 53 PMC Papers</w:t>
       </w:r>
     </w:p>
     <w:sectPr>

</xml_diff>